<commit_message>
fix the generated leave form
</commit_message>
<xml_diff>
--- a/public/templates/leave_forms/Leave_Form_Admin.docx
+++ b/public/templates/leave_forms/Leave_Form_Admin.docx
@@ -367,7 +367,7 @@
           <w:noProof/>
         </w:rPr>
         <w:drawing>
-          <wp:anchor distT="0" distB="0" distL="114300" distR="114300" simplePos="0" relativeHeight="251739136" behindDoc="0" locked="0" layoutInCell="1" allowOverlap="1" wp14:anchorId="4D25A649" wp14:editId="03105B60">
+          <wp:anchor distT="0" distB="0" distL="114300" distR="114300" simplePos="0" relativeHeight="251739136" behindDoc="0" locked="0" layoutInCell="1" allowOverlap="1" wp14:anchorId="4D25A649" wp14:editId="55AF5F6B">
             <wp:simplePos x="0" y="0"/>
             <wp:positionH relativeFrom="column">
               <wp:posOffset>97155</wp:posOffset>
@@ -548,25 +548,7 @@
           <w:sz w:val="20"/>
           <w:lang w:val="en-US"/>
         </w:rPr>
-        <w:t>Albay-</w:t>
-      </w:r>
-      <w:proofErr w:type="spellStart"/>
-      <w:r>
-        <w:rPr>
-          <w:rFonts w:ascii="Trajan Pro" w:hAnsi="Trajan Pro"/>
-          <w:sz w:val="20"/>
-          <w:lang w:val="en-US"/>
-        </w:rPr>
-        <w:t>Catanduanes</w:t>
-      </w:r>
-      <w:proofErr w:type="spellEnd"/>
-      <w:r>
-        <w:rPr>
-          <w:rFonts w:ascii="Trajan Pro" w:hAnsi="Trajan Pro"/>
-          <w:sz w:val="20"/>
-          <w:lang w:val="en-US"/>
-        </w:rPr>
-        <w:t xml:space="preserve"> Irrigation Management Office</w:t>
+        <w:t>Albay-Catanduanes Irrigation Management Office</w:t>
       </w:r>
     </w:p>
     <w:p>
@@ -580,41 +562,13 @@
           <w:lang w:val="en-US"/>
         </w:rPr>
       </w:pPr>
-      <w:proofErr w:type="spellStart"/>
       <w:r>
         <w:rPr>
           <w:rFonts w:ascii="Trajan Pro" w:hAnsi="Trajan Pro"/>
           <w:sz w:val="20"/>
           <w:lang w:val="en-US"/>
         </w:rPr>
-        <w:t>Tuburan</w:t>
-      </w:r>
-      <w:proofErr w:type="spellEnd"/>
-      <w:r>
-        <w:rPr>
-          <w:rFonts w:ascii="Trajan Pro" w:hAnsi="Trajan Pro"/>
-          <w:sz w:val="20"/>
-          <w:lang w:val="en-US"/>
-        </w:rPr>
-        <w:t xml:space="preserve">, </w:t>
-      </w:r>
-      <w:proofErr w:type="spellStart"/>
-      <w:r>
-        <w:rPr>
-          <w:rFonts w:ascii="Trajan Pro" w:hAnsi="Trajan Pro"/>
-          <w:sz w:val="20"/>
-          <w:lang w:val="en-US"/>
-        </w:rPr>
-        <w:t>Ligao</w:t>
-      </w:r>
-      <w:proofErr w:type="spellEnd"/>
-      <w:r>
-        <w:rPr>
-          <w:rFonts w:ascii="Trajan Pro" w:hAnsi="Trajan Pro"/>
-          <w:sz w:val="20"/>
-          <w:lang w:val="en-US"/>
-        </w:rPr>
-        <w:t xml:space="preserve"> City, Albay</w:t>
+        <w:t>Tuburan, Ligao City, Albay</w:t>
       </w:r>
     </w:p>
     <w:p>
@@ -969,9 +923,8 @@
                 <w:szCs w:val="20"/>
                 <w:lang w:val="en-US"/>
               </w:rPr>
-              <w:t xml:space="preserve">  </w:t>
+              <w:t xml:space="preserve">     (First)</w:t>
             </w:r>
-            <w:proofErr w:type="gramStart"/>
             <w:r>
               <w:rPr>
                 <w:rFonts w:ascii="Arial" w:hAnsi="Arial" w:cs="Arial"/>
@@ -979,9 +932,9 @@
                 <w:szCs w:val="20"/>
                 <w:lang w:val="en-US"/>
               </w:rPr>
-              <w:t xml:space="preserve">   (</w:t>
+              <w:tab/>
+              <w:t xml:space="preserve">        </w:t>
             </w:r>
-            <w:proofErr w:type="gramEnd"/>
             <w:r>
               <w:rPr>
                 <w:rFonts w:ascii="Arial" w:hAnsi="Arial" w:cs="Arial"/>
@@ -989,46 +942,7 @@
                 <w:szCs w:val="20"/>
                 <w:lang w:val="en-US"/>
               </w:rPr>
-              <w:t>First)</w:t>
-            </w:r>
-            <w:r>
-              <w:rPr>
-                <w:rFonts w:ascii="Arial" w:hAnsi="Arial" w:cs="Arial"/>
-                <w:sz w:val="20"/>
-                <w:szCs w:val="20"/>
-                <w:lang w:val="en-US"/>
-              </w:rPr>
-              <w:tab/>
-              <w:t xml:space="preserve">     </w:t>
-            </w:r>
-            <w:proofErr w:type="gramStart"/>
-            <w:r>
-              <w:rPr>
-                <w:rFonts w:ascii="Arial" w:hAnsi="Arial" w:cs="Arial"/>
-                <w:sz w:val="20"/>
-                <w:szCs w:val="20"/>
-                <w:lang w:val="en-US"/>
-              </w:rPr>
-              <w:t xml:space="preserve">   </w:t>
-            </w:r>
-            <w:r>
-              <w:rPr>
-                <w:rFonts w:ascii="Arial" w:hAnsi="Arial" w:cs="Arial"/>
-                <w:sz w:val="20"/>
-                <w:szCs w:val="20"/>
-                <w:lang w:val="en-US"/>
-              </w:rPr>
-              <w:t>(</w:t>
-            </w:r>
-            <w:proofErr w:type="gramEnd"/>
-            <w:r>
-              <w:rPr>
-                <w:rFonts w:ascii="Arial" w:hAnsi="Arial" w:cs="Arial"/>
-                <w:sz w:val="20"/>
-                <w:szCs w:val="20"/>
-                <w:lang w:val="en-US"/>
-              </w:rPr>
-              <w:t>Middle)</w:t>
+              <w:t>(Middle)</w:t>
             </w:r>
           </w:p>
           <w:p>
@@ -1497,7 +1411,6 @@
                 <w:lang w:val="en-US"/>
               </w:rPr>
             </w:pPr>
-            <w:proofErr w:type="gramStart"/>
             <w:r>
               <w:rPr>
                 <w:rFonts w:ascii="Arial" w:hAnsi="Arial" w:cs="Arial"/>
@@ -1506,18 +1419,7 @@
                 <w:szCs w:val="20"/>
                 <w:lang w:val="en-US"/>
               </w:rPr>
-              <w:t>6.A  TYPE</w:t>
-            </w:r>
-            <w:proofErr w:type="gramEnd"/>
-            <w:r>
-              <w:rPr>
-                <w:rFonts w:ascii="Arial" w:hAnsi="Arial" w:cs="Arial"/>
-                <w:i/>
-                <w:sz w:val="20"/>
-                <w:szCs w:val="20"/>
-                <w:lang w:val="en-US"/>
-              </w:rPr>
-              <w:t xml:space="preserve"> OF LEAVE TO BE AVAILED OF</w:t>
+              <w:t>6.A  TYPE OF LEAVE TO BE AVAILED OF</w:t>
             </w:r>
           </w:p>
         </w:tc>
@@ -2294,7 +2196,6 @@
                 <w:lang w:val="en-US"/>
               </w:rPr>
             </w:pPr>
-            <w:proofErr w:type="gramStart"/>
             <w:r>
               <w:rPr>
                 <w:rFonts w:ascii="Arial" w:hAnsi="Arial" w:cs="Arial"/>
@@ -2302,17 +2203,7 @@
                 <w:szCs w:val="20"/>
                 <w:lang w:val="en-US"/>
               </w:rPr>
-              <w:t>Abroad  _</w:t>
-            </w:r>
-            <w:proofErr w:type="gramEnd"/>
-            <w:r>
-              <w:rPr>
-                <w:rFonts w:ascii="Arial" w:hAnsi="Arial" w:cs="Arial"/>
-                <w:sz w:val="16"/>
-                <w:szCs w:val="20"/>
-                <w:lang w:val="en-US"/>
-              </w:rPr>
-              <w:t>_____________________________</w:t>
+              <w:t>Abroad  ______________________________</w:t>
             </w:r>
           </w:p>
         </w:tc>
@@ -4939,6 +4830,114 @@
             </w:pPr>
             <w:r>
               <w:rPr>
+                <w:rFonts w:ascii="Trajan Pro" w:hAnsi="Trajan Pro"/>
+                <w:noProof/>
+                <w:sz w:val="20"/>
+                <w:lang w:eastAsia="en-PH"/>
+              </w:rPr>
+              <mc:AlternateContent>
+                <mc:Choice Requires="wps">
+                  <w:drawing>
+                    <wp:anchor distT="45720" distB="45720" distL="114300" distR="114300" simplePos="0" relativeHeight="251742208" behindDoc="0" locked="0" layoutInCell="1" allowOverlap="1" wp14:anchorId="5C318C3E" wp14:editId="79723DF1">
+                      <wp:simplePos x="0" y="0"/>
+                      <wp:positionH relativeFrom="column">
+                        <wp:posOffset>541655</wp:posOffset>
+                      </wp:positionH>
+                      <wp:positionV relativeFrom="paragraph">
+                        <wp:posOffset>78740</wp:posOffset>
+                      </wp:positionV>
+                      <wp:extent cx="2428875" cy="337820"/>
+                      <wp:effectExtent l="0" t="0" r="9525" b="5080"/>
+                      <wp:wrapNone/>
+                      <wp:docPr id="1615750142" name="Text Box 2"/>
+                      <wp:cNvGraphicFramePr>
+                        <a:graphicFrameLocks xmlns:a="http://schemas.openxmlformats.org/drawingml/2006/main"/>
+                      </wp:cNvGraphicFramePr>
+                      <a:graphic xmlns:a="http://schemas.openxmlformats.org/drawingml/2006/main">
+                        <a:graphicData uri="http://schemas.microsoft.com/office/word/2010/wordprocessingShape">
+                          <wps:wsp>
+                            <wps:cNvSpPr txBox="1">
+                              <a:spLocks noChangeArrowheads="1"/>
+                            </wps:cNvSpPr>
+                            <wps:spPr bwMode="auto">
+                              <a:xfrm>
+                                <a:off x="0" y="0"/>
+                                <a:ext cx="2428875" cy="337820"/>
+                              </a:xfrm>
+                              <a:prstGeom prst="rect">
+                                <a:avLst/>
+                              </a:prstGeom>
+                              <a:noFill/>
+                              <a:ln w="9525">
+                                <a:noFill/>
+                                <a:miter lim="800000"/>
+                                <a:headEnd/>
+                                <a:tailEnd/>
+                              </a:ln>
+                            </wps:spPr>
+                            <wps:txbx>
+                              <w:txbxContent>
+                                <w:p>
+                                  <w:pPr>
+                                    <w:spacing w:line="240" w:lineRule="auto"/>
+                                    <w:contextualSpacing/>
+                                    <w:jc w:val="center"/>
+                                    <w:rPr>
+                                      <w:rFonts w:ascii="Cambria" w:hAnsi="Cambria"/>
+                                      <w:b/>
+                                      <w:sz w:val="20"/>
+                                      <w:szCs w:val="20"/>
+                                    </w:rPr>
+                                  </w:pPr>
+                                </w:p>
+                              </w:txbxContent>
+                            </wps:txbx>
+                            <wps:bodyPr rot="0" vert="horz" wrap="square" lIns="0" tIns="0" rIns="0" bIns="0" anchor="t" anchorCtr="0">
+                              <a:noAutofit/>
+                            </wps:bodyPr>
+                          </wps:wsp>
+                        </a:graphicData>
+                      </a:graphic>
+                      <wp14:sizeRelH relativeFrom="margin">
+                        <wp14:pctWidth>0</wp14:pctWidth>
+                      </wp14:sizeRelH>
+                      <wp14:sizeRelV relativeFrom="margin">
+                        <wp14:pctHeight>0</wp14:pctHeight>
+                      </wp14:sizeRelV>
+                    </wp:anchor>
+                  </w:drawing>
+                </mc:Choice>
+                <mc:Fallback>
+                  <w:pict>
+                    <v:shapetype w14:anchorId="5C318C3E" id="_x0000_t202" coordsize="21600,21600" o:spt="202" path="m,l,21600r21600,l21600,xe">
+                      <v:stroke joinstyle="miter"/>
+                      <v:path gradientshapeok="t" o:connecttype="rect"/>
+                    </v:shapetype>
+                    <v:shape id="_x0000_s1037" type="#_x0000_t202" style="position:absolute;margin-left:42.65pt;margin-top:6.2pt;width:191.25pt;height:26.6pt;z-index:251742208;visibility:visible;mso-wrap-style:square;mso-width-percent:0;mso-height-percent:0;mso-wrap-distance-left:9pt;mso-wrap-distance-top:3.6pt;mso-wrap-distance-right:9pt;mso-wrap-distance-bottom:3.6pt;mso-position-horizontal:absolute;mso-position-horizontal-relative:text;mso-position-vertical:absolute;mso-position-vertical-relative:text;mso-width-percent:0;mso-height-percent:0;mso-width-relative:margin;mso-height-relative:margin;v-text-anchor:top" o:gfxdata="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" filled="f" stroked="f">
+                      <v:textbox inset="0,0,0,0">
+                        <w:txbxContent>
+                          <w:p>
+                            <w:pPr>
+                              <w:spacing w:line="240" w:lineRule="auto"/>
+                              <w:contextualSpacing/>
+                              <w:jc w:val="center"/>
+                              <w:rPr>
+                                <w:rFonts w:ascii="Cambria" w:hAnsi="Cambria"/>
+                                <w:b/>
+                                <w:sz w:val="20"/>
+                                <w:szCs w:val="20"/>
+                              </w:rPr>
+                            </w:pPr>
+                          </w:p>
+                        </w:txbxContent>
+                      </v:textbox>
+                    </v:shape>
+                  </w:pict>
+                </mc:Fallback>
+              </mc:AlternateContent>
+            </w:r>
+            <w:r>
+              <w:rPr>
                 <w:rFonts w:ascii="Arial" w:hAnsi="Arial" w:cs="Arial"/>
                 <w:i/>
                 <w:sz w:val="16"/>
@@ -4946,6 +4945,15 @@
                 <w:lang w:val="en-US"/>
               </w:rPr>
               <w:t>OTHERS:</w:t>
+            </w:r>
+            <w:r>
+              <w:rPr>
+                <w:rFonts w:ascii="Trajan Pro" w:hAnsi="Trajan Pro"/>
+                <w:noProof/>
+                <w:sz w:val="20"/>
+                <w:lang w:eastAsia="en-PH"/>
+              </w:rPr>
+              <w:t xml:space="preserve"> </w:t>
             </w:r>
           </w:p>
         </w:tc>
@@ -5284,7 +5292,6 @@
                 <w:lang w:val="en-US"/>
               </w:rPr>
             </w:pPr>
-            <w:proofErr w:type="gramStart"/>
             <w:r>
               <w:rPr>
                 <w:rFonts w:ascii="Arial" w:hAnsi="Arial" w:cs="Arial"/>
@@ -5293,18 +5300,7 @@
                 <w:szCs w:val="20"/>
                 <w:lang w:val="en-US"/>
               </w:rPr>
-              <w:t>6.C  NUMBER</w:t>
-            </w:r>
-            <w:proofErr w:type="gramEnd"/>
-            <w:r>
-              <w:rPr>
-                <w:rFonts w:ascii="Arial" w:hAnsi="Arial" w:cs="Arial"/>
-                <w:i/>
-                <w:sz w:val="20"/>
-                <w:szCs w:val="20"/>
-                <w:lang w:val="en-US"/>
-              </w:rPr>
-              <w:t xml:space="preserve"> OF WORKING DAYS APPLIED FOR</w:t>
+              <w:t>6.C  NUMBER OF WORKING DAYS APPLIED FOR</w:t>
             </w:r>
           </w:p>
           <w:p>
@@ -5808,7 +5804,6 @@
                 <w:lang w:val="en-US"/>
               </w:rPr>
             </w:pPr>
-            <w:proofErr w:type="gramStart"/>
             <w:r>
               <w:rPr>
                 <w:rFonts w:ascii="Arial" w:hAnsi="Arial" w:cs="Arial"/>
@@ -5819,7 +5814,6 @@
               </w:rPr>
               <w:t>6.D  COMMUTATION</w:t>
             </w:r>
-            <w:proofErr w:type="gramEnd"/>
           </w:p>
         </w:tc>
       </w:tr>
@@ -6272,7 +6266,6 @@
                 <w:lang w:val="en-US"/>
               </w:rPr>
             </w:pPr>
-            <w:proofErr w:type="gramStart"/>
             <w:r>
               <w:rPr>
                 <w:rFonts w:ascii="Arial" w:hAnsi="Arial" w:cs="Arial"/>
@@ -6281,18 +6274,7 @@
                 <w:szCs w:val="20"/>
                 <w:lang w:val="en-US"/>
               </w:rPr>
-              <w:t>7.A  CERTIFICATION</w:t>
-            </w:r>
-            <w:proofErr w:type="gramEnd"/>
-            <w:r>
-              <w:rPr>
-                <w:rFonts w:ascii="Arial" w:hAnsi="Arial" w:cs="Arial"/>
-                <w:i/>
-                <w:sz w:val="20"/>
-                <w:szCs w:val="20"/>
-                <w:lang w:val="en-US"/>
-              </w:rPr>
-              <w:t xml:space="preserve"> OF LEAVE CREDITS</w:t>
+              <w:t>7.A  CERTIFICATION OF LEAVE CREDITS</w:t>
             </w:r>
           </w:p>
         </w:tc>
@@ -6319,7 +6301,6 @@
                 <w:lang w:val="en-US"/>
               </w:rPr>
             </w:pPr>
-            <w:proofErr w:type="gramStart"/>
             <w:r>
               <w:rPr>
                 <w:rFonts w:ascii="Arial" w:hAnsi="Arial" w:cs="Arial"/>
@@ -6330,7 +6311,6 @@
               </w:rPr>
               <w:t>7.B  RECOMMENDATION</w:t>
             </w:r>
-            <w:proofErr w:type="gramEnd"/>
           </w:p>
         </w:tc>
       </w:tr>
@@ -8200,7 +8180,6 @@
                 <w:lang w:val="en-US"/>
               </w:rPr>
             </w:pPr>
-            <w:proofErr w:type="gramStart"/>
             <w:r>
               <w:rPr>
                 <w:rFonts w:ascii="Arial" w:hAnsi="Arial" w:cs="Arial"/>
@@ -8219,18 +8198,7 @@
                 <w:szCs w:val="20"/>
                 <w:lang w:val="en-US"/>
               </w:rPr>
-              <w:t>C  APPROVED</w:t>
-            </w:r>
-            <w:proofErr w:type="gramEnd"/>
-            <w:r>
-              <w:rPr>
-                <w:rFonts w:ascii="Arial" w:hAnsi="Arial" w:cs="Arial"/>
-                <w:i/>
-                <w:sz w:val="20"/>
-                <w:szCs w:val="20"/>
-                <w:lang w:val="en-US"/>
-              </w:rPr>
-              <w:t xml:space="preserve"> FOR:</w:t>
+              <w:t>C  APPROVED FOR:</w:t>
             </w:r>
           </w:p>
           <w:p>
@@ -8526,7 +8494,6 @@
                 <w:lang w:val="en-US"/>
               </w:rPr>
             </w:pPr>
-            <w:proofErr w:type="gramStart"/>
             <w:r>
               <w:rPr>
                 <w:rFonts w:ascii="Arial" w:hAnsi="Arial" w:cs="Arial"/>
@@ -8565,18 +8532,7 @@
                 <w:szCs w:val="20"/>
                 <w:lang w:val="en-US"/>
               </w:rPr>
-              <w:t>DISAPPROVED</w:t>
-            </w:r>
-            <w:proofErr w:type="gramEnd"/>
-            <w:r>
-              <w:rPr>
-                <w:rFonts w:ascii="Arial" w:hAnsi="Arial" w:cs="Arial"/>
-                <w:i/>
-                <w:sz w:val="20"/>
-                <w:szCs w:val="20"/>
-                <w:lang w:val="en-US"/>
-              </w:rPr>
-              <w:t xml:space="preserve"> DUE TO:</w:t>
+              <w:t>DISAPPROVED DUE TO:</w:t>
             </w:r>
           </w:p>
           <w:p>
@@ -9997,7 +9953,6 @@
         </w:rPr>
         <w:t xml:space="preserve"> </w:t>
       </w:r>
-      <w:proofErr w:type="gramStart"/>
       <w:r>
         <w:rPr>
           <w:spacing w:val="-1"/>
@@ -10006,7 +9961,6 @@
         </w:rPr>
         <w:t>leave</w:t>
       </w:r>
-      <w:proofErr w:type="gramEnd"/>
       <w:r>
         <w:rPr>
           <w:spacing w:val="-3"/>
@@ -10995,7 +10949,6 @@
         </w:rPr>
         <w:t xml:space="preserve"> </w:t>
       </w:r>
-      <w:proofErr w:type="spellStart"/>
       <w:r>
         <w:rPr>
           <w:spacing w:val="-1"/>
@@ -11004,7 +10957,6 @@
         </w:rPr>
         <w:t>Availment</w:t>
       </w:r>
-      <w:proofErr w:type="spellEnd"/>
       <w:r>
         <w:rPr>
           <w:spacing w:val="21"/>
@@ -12481,7 +12433,6 @@
         </w:rPr>
         <w:t xml:space="preserve"> </w:t>
       </w:r>
-      <w:proofErr w:type="gramStart"/>
       <w:r>
         <w:rPr>
           <w:rFonts w:cs="Arial Narrow"/>
@@ -12517,7 +12468,6 @@
         </w:rPr>
         <w:t>doctor’s</w:t>
       </w:r>
-      <w:proofErr w:type="gramEnd"/>
       <w:r>
         <w:rPr>
           <w:rFonts w:cs="Arial Narrow"/>
@@ -12535,7 +12485,6 @@
         </w:rPr>
         <w:t xml:space="preserve"> </w:t>
       </w:r>
-      <w:proofErr w:type="gramStart"/>
       <w:r>
         <w:rPr>
           <w:rFonts w:cs="Arial Narrow"/>
@@ -12559,16 +12508,7 @@
           <w:w w:val="115"/>
           <w:sz w:val="16"/>
         </w:rPr>
-        <w:t>on</w:t>
-      </w:r>
-      <w:proofErr w:type="gramEnd"/>
-      <w:r>
-        <w:rPr>
-          <w:rFonts w:cs="Arial Narrow"/>
-          <w:w w:val="115"/>
-          <w:sz w:val="16"/>
-        </w:rPr>
-        <w:t xml:space="preserve"> </w:t>
+        <w:t xml:space="preserve">on </w:t>
       </w:r>
       <w:r>
         <w:rPr>
@@ -13722,23 +13662,13 @@
         </w:rPr>
         <w:t xml:space="preserve"> </w:t>
       </w:r>
-      <w:proofErr w:type="spellStart"/>
-      <w:r>
-        <w:rPr>
-          <w:spacing w:val="-1"/>
-          <w:w w:val="115"/>
-          <w:sz w:val="16"/>
-        </w:rPr>
-        <w:t>availment</w:t>
-      </w:r>
-      <w:proofErr w:type="spellEnd"/>
-      <w:r>
-        <w:rPr>
-          <w:spacing w:val="-1"/>
-          <w:w w:val="115"/>
-          <w:sz w:val="16"/>
-        </w:rPr>
-        <w:t>,</w:t>
+      <w:r>
+        <w:rPr>
+          <w:spacing w:val="-1"/>
+          <w:w w:val="115"/>
+          <w:sz w:val="16"/>
+        </w:rPr>
+        <w:t>availment,</w:t>
       </w:r>
       <w:r>
         <w:rPr>
@@ -13842,7 +13772,6 @@
         </w:rPr>
         <w:t xml:space="preserve"> </w:t>
       </w:r>
-      <w:proofErr w:type="gramStart"/>
       <w:r>
         <w:rPr>
           <w:spacing w:val="-1"/>
@@ -13851,7 +13780,6 @@
         </w:rPr>
         <w:t>leave</w:t>
       </w:r>
-      <w:proofErr w:type="gramEnd"/>
       <w:r>
         <w:rPr>
           <w:spacing w:val="15"/>
@@ -15308,7 +15236,6 @@
           <w:sz w:val="16"/>
         </w:rPr>
       </w:pPr>
-      <w:proofErr w:type="gramStart"/>
       <w:r>
         <w:rPr>
           <w:w w:val="115"/>
@@ -15329,15 +15256,7 @@
           <w:w w:val="115"/>
           <w:sz w:val="16"/>
         </w:rPr>
-        <w:t>shall</w:t>
-      </w:r>
-      <w:proofErr w:type="gramEnd"/>
-      <w:r>
-        <w:rPr>
-          <w:w w:val="115"/>
-          <w:sz w:val="16"/>
-        </w:rPr>
-        <w:t xml:space="preserve"> </w:t>
+        <w:t xml:space="preserve">shall </w:t>
       </w:r>
       <w:r>
         <w:rPr>
@@ -15347,7 +15266,6 @@
         </w:rPr>
         <w:t xml:space="preserve"> </w:t>
       </w:r>
-      <w:proofErr w:type="gramStart"/>
       <w:r>
         <w:rPr>
           <w:w w:val="115"/>
@@ -15368,15 +15286,7 @@
           <w:w w:val="115"/>
           <w:sz w:val="16"/>
         </w:rPr>
-        <w:t>filed</w:t>
-      </w:r>
-      <w:proofErr w:type="gramEnd"/>
-      <w:r>
-        <w:rPr>
-          <w:w w:val="115"/>
-          <w:sz w:val="16"/>
-        </w:rPr>
-        <w:t xml:space="preserve"> </w:t>
+        <w:t xml:space="preserve">filed </w:t>
       </w:r>
       <w:r>
         <w:rPr>
@@ -15386,7 +15296,6 @@
         </w:rPr>
         <w:t xml:space="preserve"> </w:t>
       </w:r>
-      <w:proofErr w:type="gramStart"/>
       <w:r>
         <w:rPr>
           <w:spacing w:val="-1"/>
@@ -15415,15 +15324,7 @@
           <w:w w:val="115"/>
           <w:sz w:val="16"/>
         </w:rPr>
-        <w:t>advance</w:t>
-      </w:r>
-      <w:proofErr w:type="gramEnd"/>
-      <w:r>
-        <w:rPr>
-          <w:w w:val="115"/>
-          <w:sz w:val="16"/>
-        </w:rPr>
-        <w:t xml:space="preserve"> </w:t>
+        <w:t xml:space="preserve">advance </w:t>
       </w:r>
       <w:r>
         <w:rPr>
@@ -15433,7 +15334,6 @@
         </w:rPr>
         <w:t xml:space="preserve"> </w:t>
       </w:r>
-      <w:proofErr w:type="gramStart"/>
       <w:r>
         <w:rPr>
           <w:w w:val="115"/>
@@ -15457,7 +15357,6 @@
         </w:rPr>
         <w:t>immediately</w:t>
       </w:r>
-      <w:proofErr w:type="gramEnd"/>
       <w:r>
         <w:rPr>
           <w:w w:val="115"/>
@@ -15473,7 +15372,6 @@
         </w:rPr>
         <w:t xml:space="preserve"> </w:t>
       </w:r>
-      <w:proofErr w:type="gramStart"/>
       <w:r>
         <w:rPr>
           <w:w w:val="115"/>
@@ -15494,15 +15392,7 @@
           <w:w w:val="115"/>
           <w:sz w:val="16"/>
         </w:rPr>
-        <w:t>the</w:t>
-      </w:r>
-      <w:proofErr w:type="gramEnd"/>
-      <w:r>
-        <w:rPr>
-          <w:w w:val="115"/>
-          <w:sz w:val="16"/>
-        </w:rPr>
-        <w:t xml:space="preserve"> </w:t>
+        <w:t xml:space="preserve">the </w:t>
       </w:r>
       <w:r>
         <w:rPr>
@@ -16382,18 +16272,8 @@
           <w:w w:val="115"/>
           <w:sz w:val="16"/>
         </w:rPr>
-        <w:t>Barangay/</w:t>
-      </w:r>
-      <w:proofErr w:type="spellStart"/>
-      <w:r>
-        <w:rPr>
-          <w:spacing w:val="-1"/>
-          <w:w w:val="115"/>
-          <w:sz w:val="16"/>
-        </w:rPr>
-        <w:t>Kagawad</w:t>
-      </w:r>
-      <w:proofErr w:type="spellEnd"/>
+        <w:t>Barangay/Kagawad</w:t>
+      </w:r>
       <w:r>
         <w:rPr>
           <w:spacing w:val="17"/>

</xml_diff>